<commit_message>
Convert OA to S-corp; 39.9% holder = single-member LLC (placeholder name)
Per decision: Tyler Hospice Hold, LLC elects S-corp (IRC 1361). Resolved the
eligibility blocker by replacing multi-member Adeline & Lilah with a single-member
LLC (100% Geoff) as the 39.9% holder (placeholder 'Schackmann Holdings, LLC' -
exact name TBD from user).

OA changes: S-corp title/recital; 11.2 Form 2553/1120-S + eligibility rules;
4.4 strictly pro-rata; 4.5 single class (1361(b)(1)(D)); 5.10 restricted stock +
83(b) (dropped profits-interest); added S-Corp Eligible Person def (2.27) and
9.1(e) eligibility rep; Mary Elizabeth -> spousal/community-property consent.
Hickory OA: parent now S-corp; QSub election option added.

Note: build_documents.py package narrative still reflects partnership tax + A&L +
Mary Elizabeth; that pass is pending the final holder name.

https://claude.ai/code/session_01GAHLyfqLR9bxwN2jm6VjPU
</commit_message>
<xml_diff>
--- a/sba_application/08_entity_documents/Tyler_Hospice_Hold_LLC_AMENDED_and_RESTATED_OA.docx
+++ b/sba_application/08_entity_documents/Tyler_Hospice_Hold_LLC_AMENDED_and_RESTATED_OA.docx
@@ -51,7 +51,7 @@
           <w:color w:val="6B6B6B"/>
           <w:sz w:val="20"/>
         </w:rPr>
-        <w:t>Taxed as a Partnership for U.S. Federal Income Tax Purposes</w:t>
+        <w:t>Electing S-Corporation Tax Treatment Under IRC §1361</w:t>
       </w:r>
     </w:p>
     <w:p>
@@ -86,6 +86,19 @@
       </w:pPr>
       <w:r>
         <w:rPr>
+          <w:i/>
+          <w:color w:val="6B6B6B"/>
+          <w:sz w:val="18"/>
+        </w:rPr>
+        <w:t>DRAFTING NOTE: "Schackmann Holdings, LLC" is a PLACEHOLDER for the new single-member LLC (100% owned by Geoff Schackmann) that replaces Adeline &amp; Lilah, LLC as the 39.9% member to preserve S-corporation eligibility; substitute the exact entity name and state before execution.</w:t>
+      </w:r>
+    </w:p>
+    <w:p>
+      <w:pPr>
+        <w:jc w:val="center"/>
+      </w:pPr>
+      <w:r>
+        <w:rPr>
           <w:color w:val="6B6B6B"/>
         </w:rPr>
         <w:t>────────────────────────────────────────────────────────────</w:t>
@@ -98,7 +111,7 @@
           <w:i w:val="0"/>
           <w:sz w:val="21"/>
         </w:rPr>
-        <w:t>This Amended and Restated Operating Agreement (this “Agreement”) of Tyler Hospice Hold, LLC, a Wyoming limited liability company (the “Company”), is effective as of the date last signed below (the “Effective Date”), by and among Adeline &amp; Lilah, LLC, an Arizona limited liability company (“Adeline &amp; Lilah”); James E. Bullard (“Bullard” or the “Investor”); Silas R. Shelton (“Silas”); Dana L. Davenport (“Dana”); and Bradley Gene Woodard (“Brad”) (collectively, the “Members” and each a “Member”); and, in his individual non-Member capacity, Geoff Schackmann, as Manager (“Schackmann” or the “Manager”).</w:t>
+        <w:t>This Amended and Restated Operating Agreement (this “Agreement”) of Tyler Hospice Hold, LLC, a Wyoming limited liability company (the “Company”), is effective as of the date last signed below (the “Effective Date”), by and among Schackmann Holdings, LLC, a single-member limited liability company wholly owned by Geoff Schackmann (“Schackmann Holdings, LLC”); James E. Bullard (“Bullard” or the “Investor”); Silas R. Shelton (“Silas”); Dana L. Davenport (“Dana”); and Bradley Gene Woodard (“Brad”) (collectively, the “Members” and each a “Member”); and, in his individual non-Member capacity, Geoff Schackmann, as Manager (“Schackmann” or the “Manager”).</w:t>
       </w:r>
     </w:p>
     <w:p>
@@ -128,7 +141,7 @@
           <w:i w:val="0"/>
           <w:sz w:val="21"/>
         </w:rPr>
-        <w:t>B.  This Agreement (i) conforms the Company's exact legal name to “Tyler Hospice Hold, LLC”; (ii) changes the Company's federal income-tax classification from an S corporation to a partnership; (iii) restates the capitalization table; (iv) updates the acquisition target to Hickory Hospice LLC; (v) revises the operator-member Restricted Interests so the entire interest is earned through time- and performance-based vesting; (vi) calibrates the Investor's minority-protection rights to remain consistent with U.S. Small Business Administration (“SBA”) Standard Operating Procedure 50 10; and (vii) coordinates the Company's governance with its SBA 7(a) financing and the related bank acquisition loan.</w:t>
+        <w:t>B.  This Agreement (i) conforms the Company's exact legal name to “Tyler Hospice Hold, LLC”; (ii) confirms the Company's election to be taxed as an S corporation under IRC §1361 and conforms the Company's membership to the S-corporation eligibility rules (including holding the 39.9% interest through a single-member, disregarded LLC and maintaining a single class of stock with strictly pro-rata distributions); (iii) restates the capitalization table; (iv) updates the acquisition target to Hickory Hospice LLC; (v) revises the operator-member Restricted Interests so the entire interest is earned through time- and performance-based vesting; (vi) calibrates the Investor's minority-protection rights to remain consistent with U.S. Small Business Administration (“SBA”) Standard Operating Procedure 50 10; and (vii) coordinates the Company's governance with its SBA 7(a) financing and the related bank acquisition loan.</w:t>
       </w:r>
     </w:p>
     <w:p>
@@ -668,6 +681,21 @@
         <w:t>Investor capital contribution funds designated by the Manager for, but not yet expended toward, the acquisition described in Section 3.14 at the time a refund is requested under Section 3.15.</w:t>
       </w:r>
     </w:p>
+    <w:p>
+      <w:r>
+        <w:rPr>
+          <w:b/>
+          <w:sz w:val="21"/>
+        </w:rPr>
+        <w:t xml:space="preserve">2.27  “S-Corp Eligible Person” means  </w:t>
+      </w:r>
+      <w:r>
+        <w:rPr>
+          <w:sz w:val="21"/>
+        </w:rPr>
+        <w:t>a person eligible to be a shareholder of an S corporation under IRC §1361(b)(1) - namely (a) a U.S. citizen or resident-alien individual, (b) an estate, (c) a trust described in IRC §1361(c)(2), or (d) a single-member limited liability company that is disregarded for federal tax purposes and is wholly owned by a person described in (a)-(c). No nonresident alien, partnership, multi-member LLC, or C corporation may hold a Percentage Interest.</w:t>
+      </w:r>
+    </w:p>
     <w:p/>
     <w:p>
       <w:r>
@@ -730,13 +758,13 @@
           <w:b/>
           <w:sz w:val="21"/>
         </w:rPr>
-        <w:t xml:space="preserve">3.4  Manager (Adeline &amp; Lilah) Capital Contribution.  </w:t>
+        <w:t xml:space="preserve">3.4  Manager (Schackmann Holdings, LLC) Capital Contribution.  </w:t>
       </w:r>
       <w:r>
         <w:rPr>
           <w:sz w:val="21"/>
         </w:rPr>
-        <w:t>Adeline &amp; Lilah, LLC's thirty-nine and nine-tenths percent (39.9%) Percentage Interest is issued in consideration of services rendered and to be rendered by Geoff Schackmann as Manager, including organizing and operating the Company, managing the acquisition, and building clinical and operational infrastructure.</w:t>
+        <w:t>Schackmann Holdings, LLC's thirty-nine and nine-tenths percent (39.9%) Percentage Interest is issued in consideration of services rendered and to be rendered by Geoff Schackmann as Manager, including organizing and operating the Company, managing the acquisition, and building clinical and operational infrastructure.</w:t>
       </w:r>
     </w:p>
     <w:p>
@@ -901,7 +929,7 @@
         <w:rPr>
           <w:sz w:val="21"/>
         </w:rPr>
-        <w:t>If the acquisition of the Acquired Agency is not completed within twelve (12) months of the Effective Date, Bullard may request return of any Undeployed Acquisition Funds. Within thirty (30) days, the Manager shall return such funds, which shall reduce Bullard's Percentage Interest by (Returned Amount ÷ $195,000) × 19.5%, with the corresponding percentage restored to Adeline &amp; Lilah, LLC.</w:t>
+        <w:t>If the acquisition of the Acquired Agency is not completed within twelve (12) months of the Effective Date, Bullard may request return of any Undeployed Acquisition Funds. Within thirty (30) days, the Manager shall return such funds, which shall reduce Bullard's Percentage Interest by (Returned Amount ÷ $195,000) × 19.5%, with the corresponding percentage restored to Schackmann Holdings, LLC.</w:t>
       </w:r>
     </w:p>
     <w:p>
@@ -1002,7 +1030,7 @@
         <w:rPr>
           <w:sz w:val="21"/>
         </w:rPr>
-        <w:t>Items of income, gain, loss, deduction, and credit are allocated among the Members in proportion to their Percentage Interests, in compliance with IRC §704 and the Regulations.</w:t>
+        <w:t>As required for an S corporation with a single class of stock under IRC §1361(b)(1)(D), all items of income, gain, loss, deduction, and credit are allocated among the Members strictly in proportion to their Percentage Interests, and all distributions shall be made strictly pro rata to Percentage Interests; no Member shall receive any allocation or distribution that differs in timing or amount per Percentage Interest from any other Member.</w:t>
       </w:r>
     </w:p>
     <w:p>
@@ -1017,7 +1045,7 @@
         <w:rPr>
           <w:sz w:val="21"/>
         </w:rPr>
-        <w:t>Upon dissolution, after payment of all liabilities (including the SBA Loan and Bank Acquisition Loan), remaining assets are distributed to the Members pro rata to their Percentage Interests. All Percentage Interests are treated identically for liquidation purposes, so that no Member has any priority or preference over any other as to the return of capital or liquidation proceeds, except as expressly provided herein.</w:t>
+        <w:t>Upon dissolution, after payment of all liabilities (including the SBA Loan and Bank Acquisition Loan), remaining assets are distributed to the Members pro rata to their Percentage Interests. All Percentage Interests constitute a single class of stock and are treated identically for liquidation purposes in accordance with IRC §1361(b)(1)(D) and Treasury Reg. §1.1361-1(l), so that no Member has any priority or preference over any other as to the return of capital or liquidation proceeds, except as expressly provided herein.</w:t>
       </w:r>
     </w:p>
     <w:p/>
@@ -1214,7 +1242,7 @@
         <w:rPr>
           <w:sz w:val="21"/>
         </w:rPr>
-        <w:t>As a mandatory condition of receiving a Restricted Interest, each Equity Grantee shall file a timely election under IRC §83(b) within thirty (30) days of the Effective Date by certified mail and deliver a copy to the Company within five (5) business days; failure to file by the deadline results in automatic forfeiture of the entire Restricted Interest to the Unissued Pool. The Members acknowledge that, because the Restricted Interests carry economic rights pari passu with all other interests (including in liquidation under Section 4.5), they are expected to be treated as capital interests issued for services with a nominal fair market value at the Effective Date, and the Section 83(b) election is intended to fix that value and start the holding period; if the Company and its tax advisors instead elect to structure the grants as profits interests under Rev. Proc. 93-27 and 2001-43, the Manager is authorized to implement a liquidation threshold (distribution “hurdle”) so that each Equity Grantee shares only in appreciation after the grant date. Each Equity Grantee should consult independent tax counsel; nothing herein is tax advice from the Company or the Manager.</w:t>
+        <w:t>As a mandatory condition of receiving a Restricted Interest, each Equity Grantee shall file a timely election under IRC §83(b) within thirty (30) days of the Effective Date by certified mail and deliver a copy to the Company within five (5) business days; failure to file by the deadline results in automatic forfeiture of the entire Restricted Interest to the Unissued Pool. The Restricted Interests are restricted shares of the Company's single class of stock issued for services; the Section 83(b) election fixes their nominal fair market value at the Effective Date and starts the holding period, and is also intended to ensure each Restricted Interest is treated as outstanding stock so as to preserve the S-corporation election under IRC §1361. The differential good-leaver / bad-leaver repurchase terms in this Article V are a bona fide buy-sell arrangement and are not intended to create a second class of stock under Treasury Reg. §1.1361-1(l)(2)(iii). Each Equity Grantee should consult independent tax counsel; nothing herein is tax advice from the Company or the Manager.</w:t>
       </w:r>
     </w:p>
     <w:p>
@@ -1371,7 +1399,7 @@
           <w:i w:val="0"/>
           <w:sz w:val="21"/>
         </w:rPr>
-        <w:t>For the avoidance of doubt, Adeline &amp; Lilah, LLC may pass a Reserved Matter only by combining its 39.9% with the votes of at least two (2) Equity Grantees (66.5% total) or with Bullard's 19.5% plus at least one (1) Equity Grantee (72.7% total); Bullard holds no unilateral veto on Reserved Matters.</w:t>
+        <w:t>For the avoidance of doubt, Schackmann Holdings, LLC may pass a Reserved Matter only by combining its 39.9% with the votes of at least two (2) Equity Grantees (66.5% total) or with Bullard's 19.5% plus at least one (1) Equity Grantee (72.7% total); Bullard holds no unilateral veto on Reserved Matters.</w:t>
       </w:r>
     </w:p>
     <w:p>
@@ -1431,7 +1459,7 @@
         <w:rPr>
           <w:sz w:val="21"/>
         </w:rPr>
-        <w:t>On a Key Person Event affecting Geoff Schackmann (death, permanent disability, or incapacity), the Company continues under interim management designated by Adeline &amp; Lilah, LLC's authorized successor for up to ninety (90) days, after which the Members elect a successor Manager by majority vote. Bullard is notified within five (5) business days and votes in the successor election; during the interim period, material financial decisions exceeding $25,000 require Bullard's written approval.</w:t>
+        <w:t>On a Key Person Event affecting Geoff Schackmann (death, permanent disability, or incapacity), the Company continues under interim management designated by Schackmann Holdings, LLC, LLC's authorized successor for up to ninety (90) days, after which the Members elect a successor Manager by majority vote. Bullard is notified within five (5) business days and votes in the successor election; during the interim period, material financial decisions exceeding $25,000 require Bullard's written approval.</w:t>
       </w:r>
     </w:p>
     <w:p>
@@ -1633,7 +1661,7 @@
         <w:rPr>
           <w:sz w:val="21"/>
         </w:rPr>
-        <w:t>A Member may assign, by gift or upon death, to a spouse, child, or revocable living trust, provided (a) for a trust, the Member retains sole voting control; (b) Adeline &amp; Lilah, LLC remains Manager; and (c) Bullard receives written notice within five (5) business days. No other exception applies without Bullard's written consent.</w:t>
+        <w:t>A Member may assign, by gift or upon death, to a spouse, child, or revocable living trust, provided (a) for a trust, the Member retains sole voting control; (b) Schackmann Holdings, LLC remains Manager; and (c) Bullard receives written notice within five (5) business days. No other exception applies without Bullard's written consent.</w:t>
       </w:r>
     </w:p>
     <w:p>
@@ -1678,7 +1706,7 @@
         <w:rPr>
           <w:sz w:val="21"/>
         </w:rPr>
-        <w:t>If Adeline &amp; Lilah proposes a Transfer constituting a Change of Control, Bullard may participate pro rata on the same terms, with at least twenty (20) days' notice.</w:t>
+        <w:t>If Schackmann Holdings, LLC proposes a Transfer constituting a Change of Control, Bullard may participate pro rata on the same terms, with at least twenty (20) days' notice.</w:t>
       </w:r>
     </w:p>
     <w:p>
@@ -1708,7 +1736,7 @@
         <w:rPr>
           <w:sz w:val="21"/>
         </w:rPr>
-        <w:t>After the Lock-Up Period, if Schackmann (for himself and Adeline &amp; Lilah) and Bullard cannot resolve a material dispute after thirty (30) days of good-faith negotiation, either may invoke the buy-sell by naming an enterprise valuation, from which buyout amounts are computed pro rata; Unvested Restricted Interests are forfeited at closing without compensation and Vested interests are treated as fully vested subject to the ROFR. Notwithstanding the foregoing, NO Member may invoke or enforce this Section 8.10 while any principal or interest under the SBA Loan remains outstanding; upon payment in full of the SBA Loan (and any SBA-guaranteed successor/refinancing), this deferral lapses.</w:t>
+        <w:t>After the Lock-Up Period, if Schackmann (for himself and Schackmann Holdings, LLC) and Bullard cannot resolve a material dispute after thirty (30) days of good-faith negotiation, either may invoke the buy-sell by naming an enterprise valuation, from which buyout amounts are computed pro rata; Unvested Restricted Interests are forfeited at closing without compensation and Vested interests are treated as fully vested subject to the ROFR. Notwithstanding the foregoing, NO Member may invoke or enforce this Section 8.10 while any principal or interest under the SBA Loan remains outstanding; upon payment in full of the SBA Loan (and any SBA-guaranteed successor/refinancing), this deferral lapses.</w:t>
       </w:r>
     </w:p>
     <w:p>
@@ -1749,7 +1777,7 @@
         <w:rPr>
           <w:sz w:val="21"/>
         </w:rPr>
-        <w:t>Each Member represents and warrants, as of the Effective Date and continuously: (a) Authority - full capacity and authority to execute and perform, and that this Agreement is binding; (b) No Conflicts - execution does not violate any agreement, law, or obligation; (c) No Litigation - no pending or threatened proceeding that would materially affect the Company or the Member's performance; and (d) OIG and SAM Exclusion - no Member, and no individual with a beneficial ownership interest in any Member entity, is excluded, suspended, debarred, or otherwise ineligible to participate in any federal or state healthcare program (per the OIG LEIE or SAM.gov databases), with a duty to notify the Manager within five (5) business days of any threatened or actual exclusion.</w:t>
+        <w:t>Each Member represents and warrants, as of the Effective Date and continuously: (a) Authority - full capacity and authority to execute and perform, and that this Agreement is binding; (b) No Conflicts - execution does not violate any agreement, law, or obligation; (c) No Litigation - no pending or threatened proceeding that would materially affect the Company or the Member's performance; and (d) OIG and SAM Exclusion - no Member, and no individual with a beneficial ownership interest in any Member entity, is excluded, suspended, debarred, or otherwise ineligible to participate in any federal or state healthcare program (per the OIG LEIE or SAM.gov databases), with a duty to notify the Manager within five (5) business days of any threatened or actual exclusion; and (e) S-Corp Eligibility - each Member is, and shall remain, an S-Corp Eligible Person as defined in Section 2.27, and shall notify the Manager within five (5) business days of any change that would cause it to cease to be one.</w:t>
       </w:r>
     </w:p>
     <w:p>
@@ -1790,7 +1818,7 @@
         <w:rPr>
           <w:sz w:val="21"/>
         </w:rPr>
-        <w:t>The Company shall indemnify and hold harmless the Manager and Adeline &amp; Lilah, LLC and their respective members, managers, officers, employees, and agents from claims arising from the management or operation of the Company or good-faith actions under this Agreement, except for fraud, willful misconduct, gross negligence, improper personal benefit, or breach of this Agreement.</w:t>
+        <w:t>The Company shall indemnify and hold harmless the Manager and Schackmann Holdings, LLC and their respective members, managers, officers, employees, and agents from claims arising from the management or operation of the Company or good-faith actions under this Agreement, except for fraud, willful misconduct, gross negligence, improper personal benefit, or breach of this Agreement.</w:t>
       </w:r>
     </w:p>
     <w:p>
@@ -1861,7 +1889,7 @@
         <w:rPr>
           <w:sz w:val="21"/>
         </w:rPr>
-        <w:t>The Company shall be treated as a partnership for U.S. federal income tax purposes under subchapter K of the Code. No election shall be made to treat the Company as an association taxable as a corporation (including no election under Treasury Reg. §301.7701-3 and no election under IRC §1361) without the prior written consent of all Members. The Manager shall serve as the Company's partnership representative under IRC §6223 and shall cause the timely preparation and filing of all returns (including Form 1065 and Schedule K-1 to each Member) within seventy-five (75) days of each fiscal year-end. The Acquired Agency, as a wholly owned single-member subsidiary, shall be a disregarded entity whose items are reported by the Company, unless the Manager and the Members' tax advisors determine otherwise.</w:t>
+        <w:t>The Company has elected, or shall elect, to be taxed as an S corporation for U.S. federal income tax purposes under IRC §1361 by timely filing (or obtaining late-election relief under Rev. Proc. 2013-30 for) IRS Form 2553, and the Members shall cooperate in executing all documents required to make and maintain the election. The Company shall at all times satisfy the S-corporation eligibility requirements, including: (a) every shareholder is an eligible shareholder (a U.S. individual, an estate, an eligible trust, or a single-member disregarded LLC owned by an eligible individual) - accordingly the 39.9% interest is held by a single-member LLC wholly owned by Geoff Schackmann; (b) the Company maintains a single class of stock with strictly pro-rata allocations and distributions (Sections 4.4-4.5); and (c) the number of shareholders does not exceed the statutory limit. No Transfer or admission may be made that would terminate the S-election (Sections 8.5, 8.11, and Article XII). The Manager shall serve as the Company's tax representative, shall cause the timely preparation and filing of all returns (including Form 1120-S and Schedule K-1 to each Member) within seventy-five (75) days of each fiscal year-end. The Acquired Agency, as a wholly owned single-member subsidiary, shall be a disregarded entity (or a qualified subchapter S subsidiary, if the Manager so elects) whose items are reported by the Company.</w:t>
       </w:r>
     </w:p>
     <w:p>
@@ -2216,7 +2244,7 @@
           <w:i w:val="0"/>
           <w:sz w:val="20"/>
         </w:rPr>
-        <w:t>MEMBER - ADELINE &amp; LILAH, LLC (Interest: 39.9%)</w:t>
+        <w:t>MEMBER - SCHACKMANN HOLDINGS, LLC (Interest: 39.9%; single-member LLC wholly owned by Geoff Schackmann)</w:t>
       </w:r>
     </w:p>
     <w:p>
@@ -2236,7 +2264,7 @@
           <w:i w:val="0"/>
           <w:sz w:val="19"/>
         </w:rPr>
-        <w:t>By: Geoff Schackmann, Authorized Representative (50% member)</w:t>
+        <w:t>By: Geoff Schackmann, Sole Member and Manager</w:t>
       </w:r>
     </w:p>
     <w:p>
@@ -2265,7 +2293,7 @@
           <w:i w:val="0"/>
           <w:sz w:val="20"/>
         </w:rPr>
-        <w:t>CONSENT OF SECOND MEMBER OF ADELINE &amp; LILAH, LLC</w:t>
+        <w:t>SPOUSAL / COMMUNITY-PROPERTY CONSENT</w:t>
       </w:r>
     </w:p>
     <w:p>
@@ -2285,7 +2313,7 @@
           <w:i w:val="0"/>
           <w:sz w:val="19"/>
         </w:rPr>
-        <w:t>Mary Elizabeth Burcham, 50% member of Adeline &amp; Lilah, LLC - consents to Adeline &amp; Lilah, LLC entering into this Agreement and, as the spouse of Geoff Schackmann, acknowledges and consents to its terms.</w:t>
+        <w:t>Mary Elizabeth Burcham, spouse of Geoff Schackmann - consents to this Agreement and to Geoff Schackmann's ownership of Schackmann Holdings, LLC and its 39.9% Membership Interest, and waives any community-property claim inconsistent with this Agreement and the Company's S-corporation eligibility.</w:t>
       </w:r>
     </w:p>
     <w:p>
@@ -2579,7 +2607,7 @@
               <w:rPr>
                 <w:sz w:val="19"/>
               </w:rPr>
-              <w:t>Adeline &amp; Lilah, LLC (Arizona)</w:t>
+              <w:t>Schackmann Holdings, LLC (single-member; 100% Geoff Schackmann)</w:t>
             </w:r>
           </w:p>
         </w:tc>

</xml_diff>

<commit_message>
OA: 39.9% holder = Geoff Schackmann directly (individual), not an LLC
Per decision: replace Adeline & Lilah with Geoff Schackmann individually as the
39.9% member (an eligible S-corp shareholder - no holding LLC needed). Geoff is a
Member and the Manager; Mary Elizabeth -> spousal/community-property consent only.
Fixed member/manager duality, recital, 6.2, 11.2 eligibility, signature blocks,
cap table, and the mangled spousal-consent sentence from the global swap.

https://claude.ai/code/session_01GAHLyfqLR9bxwN2jm6VjPU
</commit_message>
<xml_diff>
--- a/sba_application/08_entity_documents/Tyler_Hospice_Hold_LLC_AMENDED_and_RESTATED_OA.docx
+++ b/sba_application/08_entity_documents/Tyler_Hospice_Hold_LLC_AMENDED_and_RESTATED_OA.docx
@@ -90,7 +90,7 @@
           <w:color w:val="6B6B6B"/>
           <w:sz w:val="18"/>
         </w:rPr>
-        <w:t>DRAFTING NOTE: "Schackmann Holdings, LLC" is a PLACEHOLDER for the new single-member LLC (100% owned by Geoff Schackmann) that replaces Adeline &amp; Lilah, LLC as the 39.9% member to preserve S-corporation eligibility; substitute the exact entity name and state before execution.</w:t>
+        <w:t>Geoff Schackmann holds the 39.9% Membership Interest directly, as an individual (an eligible S-corporation shareholder), replacing the former Adeline &amp; Lilah, LLC holder.</w:t>
       </w:r>
     </w:p>
     <w:p>
@@ -111,7 +111,7 @@
           <w:i w:val="0"/>
           <w:sz w:val="21"/>
         </w:rPr>
-        <w:t>This Amended and Restated Operating Agreement (this “Agreement”) of Tyler Hospice Hold, LLC, a Wyoming limited liability company (the “Company”), is effective as of the date last signed below (the “Effective Date”), by and among Schackmann Holdings, LLC, a single-member limited liability company wholly owned by Geoff Schackmann (“Schackmann Holdings, LLC”); James E. Bullard (“Bullard” or the “Investor”); Silas R. Shelton (“Silas”); Dana L. Davenport (“Dana”); and Bradley Gene Woodard (“Brad”) (collectively, the “Members” and each a “Member”); and, in his individual non-Member capacity, Geoff Schackmann, as Manager (“Schackmann” or the “Manager”).</w:t>
+        <w:t>This Amended and Restated Operating Agreement (this “Agreement”) of Tyler Hospice Hold, LLC, a Wyoming limited liability company (the “Company”), is effective as of the date last signed below (the “Effective Date”), by and among Geoff Schackmann, an individual (“Geoff Schackmann”); James E. Bullard (“Bullard” or the “Investor”); Silas R. Shelton (“Silas”); Dana L. Davenport (“Dana”); and Bradley Gene Woodard (“Brad”) (collectively, the “Members” and each a “Member”). Geoff Schackmann, who is a Member, also serves as the Company's manager (in that capacity, the “Manager”).</w:t>
       </w:r>
     </w:p>
     <w:p>
@@ -141,7 +141,7 @@
           <w:i w:val="0"/>
           <w:sz w:val="21"/>
         </w:rPr>
-        <w:t>B.  This Agreement (i) conforms the Company's exact legal name to “Tyler Hospice Hold, LLC”; (ii) confirms the Company's election to be taxed as an S corporation under IRC §1361 and conforms the Company's membership to the S-corporation eligibility rules (including holding the 39.9% interest through a single-member, disregarded LLC and maintaining a single class of stock with strictly pro-rata distributions); (iii) restates the capitalization table; (iv) updates the acquisition target to Hickory Hospice LLC; (v) revises the operator-member Restricted Interests so the entire interest is earned through time- and performance-based vesting; (vi) calibrates the Investor's minority-protection rights to remain consistent with U.S. Small Business Administration (“SBA”) Standard Operating Procedure 50 10; and (vii) coordinates the Company's governance with its SBA 7(a) financing and the related bank acquisition loan.</w:t>
+        <w:t>B.  This Agreement (i) conforms the Company's exact legal name to “Tyler Hospice Hold, LLC”; (ii) confirms the Company's election to be taxed as an S corporation under IRC §1361 and conforms the Company's membership to the S-corporation eligibility rules (the 39.9% interest is held directly by Geoff Schackmann, an eligible individual, and the Company maintains a single class of stock with strictly pro-rata distributions); (iii) restates the capitalization table; (iv) updates the acquisition target to Hickory Hospice LLC; (v) revises the operator-member Restricted Interests so the entire interest is earned through time- and performance-based vesting; (vi) calibrates the Investor's minority-protection rights to remain consistent with U.S. Small Business Administration (“SBA”) Standard Operating Procedure 50 10; and (vii) coordinates the Company's governance with its SBA 7(a) financing and the related bank acquisition loan.</w:t>
       </w:r>
     </w:p>
     <w:p>
@@ -758,13 +758,13 @@
           <w:b/>
           <w:sz w:val="21"/>
         </w:rPr>
-        <w:t xml:space="preserve">3.4  Manager (Schackmann Holdings, LLC) Capital Contribution.  </w:t>
+        <w:t xml:space="preserve">3.4  Manager (Geoff Schackmann) Capital Contribution.  </w:t>
       </w:r>
       <w:r>
         <w:rPr>
           <w:sz w:val="21"/>
         </w:rPr>
-        <w:t>Schackmann Holdings, LLC's thirty-nine and nine-tenths percent (39.9%) Percentage Interest is issued in consideration of services rendered and to be rendered by Geoff Schackmann as Manager, including organizing and operating the Company, managing the acquisition, and building clinical and operational infrastructure.</w:t>
+        <w:t>Geoff Schackmann's thirty-nine and nine-tenths percent (39.9%) Percentage Interest is issued in consideration of services rendered and to be rendered by Geoff Schackmann as Manager, including organizing and operating the Company, managing the acquisition, and building clinical and operational infrastructure.</w:t>
       </w:r>
     </w:p>
     <w:p>
@@ -929,7 +929,7 @@
         <w:rPr>
           <w:sz w:val="21"/>
         </w:rPr>
-        <w:t>If the acquisition of the Acquired Agency is not completed within twelve (12) months of the Effective Date, Bullard may request return of any Undeployed Acquisition Funds. Within thirty (30) days, the Manager shall return such funds, which shall reduce Bullard's Percentage Interest by (Returned Amount ÷ $195,000) × 19.5%, with the corresponding percentage restored to Schackmann Holdings, LLC.</w:t>
+        <w:t>If the acquisition of the Acquired Agency is not completed within twelve (12) months of the Effective Date, Bullard may request return of any Undeployed Acquisition Funds. Within thirty (30) days, the Manager shall return such funds, which shall reduce Bullard's Percentage Interest by (Returned Amount ÷ $195,000) × 19.5%, with the corresponding percentage restored to Geoff Schackmann.</w:t>
       </w:r>
     </w:p>
     <w:p>
@@ -1298,7 +1298,7 @@
         <w:rPr>
           <w:sz w:val="21"/>
         </w:rPr>
-        <w:t>The Manager shall not, without the prior written consent of Members holding at least sixty percent (60%) of outstanding Percentage Interests, take any of the following actions; the parties acknowledge that, after the restatement, no single Member holds 60% and Adeline &amp; Lilah, LLC (39.9%) cannot unilaterally pass a Reserved Matter:</w:t>
+        <w:t>The Manager shall not, without the prior written consent of Members holding at least sixty percent (60%) of outstanding Percentage Interests, take any of the following actions; the parties acknowledge that, after the restatement, no single Member holds 60% and Geoff Schackmann (39.9%) cannot unilaterally pass a Reserved Matter:</w:t>
       </w:r>
     </w:p>
     <w:p>
@@ -1399,7 +1399,7 @@
           <w:i w:val="0"/>
           <w:sz w:val="21"/>
         </w:rPr>
-        <w:t>For the avoidance of doubt, Schackmann Holdings, LLC may pass a Reserved Matter only by combining its 39.9% with the votes of at least two (2) Equity Grantees (66.5% total) or with Bullard's 19.5% plus at least one (1) Equity Grantee (72.7% total); Bullard holds no unilateral veto on Reserved Matters.</w:t>
+        <w:t>For the avoidance of doubt, Geoff Schackmann may pass a Reserved Matter only by combining his 39.9% with the votes of at least two (2) Equity Grantees (66.5% total) or with Bullard's 19.5% plus at least one (1) Equity Grantee (72.7% total); Bullard holds no unilateral veto on Reserved Matters.</w:t>
       </w:r>
     </w:p>
     <w:p>
@@ -1459,7 +1459,7 @@
         <w:rPr>
           <w:sz w:val="21"/>
         </w:rPr>
-        <w:t>On a Key Person Event affecting Geoff Schackmann (death, permanent disability, or incapacity), the Company continues under interim management designated by Schackmann Holdings, LLC, LLC's authorized successor for up to ninety (90) days, after which the Members elect a successor Manager by majority vote. Bullard is notified within five (5) business days and votes in the successor election; during the interim period, material financial decisions exceeding $25,000 require Bullard's written approval.</w:t>
+        <w:t>On a Key Person Event affecting Geoff Schackmann (death, permanent disability, or incapacity), the Company continues under interim management designated by Geoff Schackmann, LLC's authorized successor for up to ninety (90) days, after which the Members elect a successor Manager by majority vote. Bullard is notified within five (5) business days and votes in the successor election; during the interim period, material financial decisions exceeding $25,000 require Bullard's written approval.</w:t>
       </w:r>
     </w:p>
     <w:p>
@@ -1661,7 +1661,7 @@
         <w:rPr>
           <w:sz w:val="21"/>
         </w:rPr>
-        <w:t>A Member may assign, by gift or upon death, to a spouse, child, or revocable living trust, provided (a) for a trust, the Member retains sole voting control; (b) Schackmann Holdings, LLC remains Manager; and (c) Bullard receives written notice within five (5) business days. No other exception applies without Bullard's written consent.</w:t>
+        <w:t>A Member may assign, by gift or upon death, to a spouse, child, or revocable living trust, provided (a) for a trust, the Member retains sole voting control; (b) Geoff Schackmann remains Manager; and (c) Bullard receives written notice within five (5) business days. No other exception applies without Bullard's written consent.</w:t>
       </w:r>
     </w:p>
     <w:p>
@@ -1706,7 +1706,7 @@
         <w:rPr>
           <w:sz w:val="21"/>
         </w:rPr>
-        <w:t>If Schackmann Holdings, LLC proposes a Transfer constituting a Change of Control, Bullard may participate pro rata on the same terms, with at least twenty (20) days' notice.</w:t>
+        <w:t>If Geoff Schackmann proposes a Transfer constituting a Change of Control, Bullard may participate pro rata on the same terms, with at least twenty (20) days' notice.</w:t>
       </w:r>
     </w:p>
     <w:p>
@@ -1736,7 +1736,7 @@
         <w:rPr>
           <w:sz w:val="21"/>
         </w:rPr>
-        <w:t>After the Lock-Up Period, if Schackmann (for himself and Schackmann Holdings, LLC) and Bullard cannot resolve a material dispute after thirty (30) days of good-faith negotiation, either may invoke the buy-sell by naming an enterprise valuation, from which buyout amounts are computed pro rata; Unvested Restricted Interests are forfeited at closing without compensation and Vested interests are treated as fully vested subject to the ROFR. Notwithstanding the foregoing, NO Member may invoke or enforce this Section 8.10 while any principal or interest under the SBA Loan remains outstanding; upon payment in full of the SBA Loan (and any SBA-guaranteed successor/refinancing), this deferral lapses.</w:t>
+        <w:t>After the Lock-Up Period, if Schackmann (for himself and Geoff Schackmann) and Bullard cannot resolve a material dispute after thirty (30) days of good-faith negotiation, either may invoke the buy-sell by naming an enterprise valuation, from which buyout amounts are computed pro rata; Unvested Restricted Interests are forfeited at closing without compensation and Vested interests are treated as fully vested subject to the ROFR. Notwithstanding the foregoing, NO Member may invoke or enforce this Section 8.10 while any principal or interest under the SBA Loan remains outstanding; upon payment in full of the SBA Loan (and any SBA-guaranteed successor/refinancing), this deferral lapses.</w:t>
       </w:r>
     </w:p>
     <w:p>
@@ -1818,7 +1818,7 @@
         <w:rPr>
           <w:sz w:val="21"/>
         </w:rPr>
-        <w:t>The Company shall indemnify and hold harmless the Manager and Schackmann Holdings, LLC and their respective members, managers, officers, employees, and agents from claims arising from the management or operation of the Company or good-faith actions under this Agreement, except for fraud, willful misconduct, gross negligence, improper personal benefit, or breach of this Agreement.</w:t>
+        <w:t>The Company shall indemnify and hold harmless the Manager and Geoff Schackmann and their respective members, managers, officers, employees, and agents from claims arising from the management or operation of the Company or good-faith actions under this Agreement, except for fraud, willful misconduct, gross negligence, improper personal benefit, or breach of this Agreement.</w:t>
       </w:r>
     </w:p>
     <w:p>
@@ -1889,7 +1889,7 @@
         <w:rPr>
           <w:sz w:val="21"/>
         </w:rPr>
-        <w:t>The Company has elected, or shall elect, to be taxed as an S corporation for U.S. federal income tax purposes under IRC §1361 by timely filing (or obtaining late-election relief under Rev. Proc. 2013-30 for) IRS Form 2553, and the Members shall cooperate in executing all documents required to make and maintain the election. The Company shall at all times satisfy the S-corporation eligibility requirements, including: (a) every shareholder is an eligible shareholder (a U.S. individual, an estate, an eligible trust, or a single-member disregarded LLC owned by an eligible individual) - accordingly the 39.9% interest is held by a single-member LLC wholly owned by Geoff Schackmann; (b) the Company maintains a single class of stock with strictly pro-rata allocations and distributions (Sections 4.4-4.5); and (c) the number of shareholders does not exceed the statutory limit. No Transfer or admission may be made that would terminate the S-election (Sections 8.5, 8.11, and Article XII). The Manager shall serve as the Company's tax representative, shall cause the timely preparation and filing of all returns (including Form 1120-S and Schedule K-1 to each Member) within seventy-five (75) days of each fiscal year-end. The Acquired Agency, as a wholly owned single-member subsidiary, shall be a disregarded entity (or a qualified subchapter S subsidiary, if the Manager so elects) whose items are reported by the Company.</w:t>
+        <w:t>The Company has elected, or shall elect, to be taxed as an S corporation for U.S. federal income tax purposes under IRC §1361 by timely filing (or obtaining late-election relief under Rev. Proc. 2013-30 for) IRS Form 2553, and the Members shall cooperate in executing all documents required to make and maintain the election. The Company shall at all times satisfy the S-corporation eligibility requirements, including: (a) every shareholder is an eligible shareholder (a U.S. individual, an estate, an eligible trust, or a single-member disregarded LLC owned by an eligible individual) - accordingly the 39.9% interest is held directly by Geoff Schackmann, an eligible individual; (b) the Company maintains a single class of stock with strictly pro-rata allocations and distributions (Sections 4.4-4.5); and (c) the number of shareholders does not exceed the statutory limit. No Transfer or admission may be made that would terminate the S-election (Sections 8.5, 8.11, and Article XII). The Manager shall serve as the Company's tax representative, shall cause the timely preparation and filing of all returns (including Form 1120-S and Schedule K-1 to each Member) within seventy-five (75) days of each fiscal year-end. The Acquired Agency, as a wholly owned single-member subsidiary, shall be a disregarded entity (or a qualified subchapter S subsidiary, if the Manager so elects) whose items are reported by the Company.</w:t>
       </w:r>
     </w:p>
     <w:p>
@@ -2195,7 +2195,7 @@
           <w:i w:val="0"/>
           <w:sz w:val="20"/>
         </w:rPr>
-        <w:t>MANAGER (individually) - GEOFF SCHACKMANN</w:t>
+        <w:t>MEMBER AND MANAGER - GEOFF SCHACKMANN (Interest: 39.9%)</w:t>
       </w:r>
     </w:p>
     <w:p>
@@ -2215,7 +2215,7 @@
           <w:i w:val="0"/>
           <w:sz w:val="19"/>
         </w:rPr>
-        <w:t>Geoff Schackmann, Manager (non-Member capacity)</w:t>
+        <w:t>Geoff Schackmann, individually, as a Member and as the Company's Manager</w:t>
       </w:r>
     </w:p>
     <w:p>
@@ -2244,7 +2244,7 @@
           <w:i w:val="0"/>
           <w:sz w:val="20"/>
         </w:rPr>
-        <w:t>MEMBER - SCHACKMANN HOLDINGS, LLC (Interest: 39.9%; single-member LLC wholly owned by Geoff Schackmann)</w:t>
+        <w:t>SPOUSAL / COMMUNITY-PROPERTY CONSENT</w:t>
       </w:r>
     </w:p>
     <w:p>
@@ -2264,56 +2264,7 @@
           <w:i w:val="0"/>
           <w:sz w:val="19"/>
         </w:rPr>
-        <w:t>By: Geoff Schackmann, Sole Member and Manager</w:t>
-      </w:r>
-    </w:p>
-    <w:p>
-      <w:r>
-        <w:rPr>
-          <w:b w:val="0"/>
-          <w:i w:val="0"/>
-          <w:sz w:val="19"/>
-        </w:rPr>
-        <w:t>4602 E Cheery Lynn Rd, Phoenix, Arizona 85018</w:t>
-      </w:r>
-    </w:p>
-    <w:p>
-      <w:r>
-        <w:rPr>
-          <w:b w:val="0"/>
-          <w:i w:val="0"/>
-          <w:sz w:val="21"/>
-        </w:rPr>
-      </w:r>
-    </w:p>
-    <w:p>
-      <w:r>
-        <w:rPr>
-          <w:b/>
-          <w:i w:val="0"/>
-          <w:sz w:val="20"/>
-        </w:rPr>
-        <w:t>SPOUSAL / COMMUNITY-PROPERTY CONSENT</w:t>
-      </w:r>
-    </w:p>
-    <w:p>
-      <w:r>
-        <w:rPr>
-          <w:b w:val="0"/>
-          <w:i w:val="0"/>
-          <w:sz w:val="20"/>
-        </w:rPr>
-        <w:t>By: _________________________________________   Date: ______________</w:t>
-      </w:r>
-    </w:p>
-    <w:p>
-      <w:r>
-        <w:rPr>
-          <w:b w:val="0"/>
-          <w:i w:val="0"/>
-          <w:sz w:val="19"/>
-        </w:rPr>
-        <w:t>Mary Elizabeth Burcham, spouse of Geoff Schackmann - consents to this Agreement and to Geoff Schackmann's ownership of Schackmann Holdings, LLC and its 39.9% Membership Interest, and waives any community-property claim inconsistent with this Agreement and the Company's S-corporation eligibility.</w:t>
+        <w:t>Mary Elizabeth Burcham, spouse of Geoff Schackmann - consents to this Agreement and to Geoff Schackmann's direct ownership of the 39.9% Membership Interest, and waives any community-property claim inconsistent with this Agreement and the Company's S-corporation eligibility (single eligible shareholder).</w:t>
       </w:r>
     </w:p>
     <w:p>
@@ -2607,7 +2558,7 @@
               <w:rPr>
                 <w:sz w:val="19"/>
               </w:rPr>
-              <w:t>Schackmann Holdings, LLC (single-member; 100% Geoff Schackmann)</w:t>
+              <w:t>Geoff Schackmann (individual)</w:t>
             </w:r>
           </w:p>
         </w:tc>

</xml_diff>